<commit_message>
feat(web-app): improve dashboard analytics layout and normalize sensor data case-sensitivity
</commit_message>
<xml_diff>
--- a/docs/Project Documentation.docx
+++ b/docs/Project Documentation.docx
@@ -31,7 +31,29 @@
           <w:sz w:val="32"/>
           <w:szCs w:val="32"/>
         </w:rPr>
-        <w:t>Smart CoE Monitoring</w:t>
+        <w:t xml:space="preserve">Smart </w:t>
+      </w:r>
+      <w:proofErr w:type="spellStart"/>
+      <w:r>
+        <w:rPr>
+          <w:rFonts w:ascii="TH Sarabun New" w:hAnsi="TH Sarabun New" w:cs="TH Sarabun New"/>
+          <w:b/>
+          <w:bCs/>
+          <w:sz w:val="32"/>
+          <w:szCs w:val="32"/>
+        </w:rPr>
+        <w:t>CoE</w:t>
+      </w:r>
+      <w:proofErr w:type="spellEnd"/>
+      <w:r>
+        <w:rPr>
+          <w:rFonts w:ascii="TH Sarabun New" w:hAnsi="TH Sarabun New" w:cs="TH Sarabun New"/>
+          <w:b/>
+          <w:bCs/>
+          <w:sz w:val="32"/>
+          <w:szCs w:val="32"/>
+        </w:rPr>
+        <w:t xml:space="preserve"> Monitoring</w:t>
       </w:r>
     </w:p>
     <w:p>
@@ -68,13 +90,23 @@
         </w:rPr>
         <w:t>สำหรับตรวจวัดและรวบรวมข้อมูลสภาพแวดล้อมจากห้องต่างๆ ภายในอาคารภาควิชาวิศวกรรมคอมพิวเตอร์ (</w:t>
       </w:r>
-      <w:r>
-        <w:rPr>
-          <w:rFonts w:ascii="TH Sarabun New" w:hAnsi="TH Sarabun New" w:cs="TH Sarabun New"/>
-          <w:sz w:val="32"/>
-          <w:szCs w:val="32"/>
-        </w:rPr>
-        <w:t xml:space="preserve">CoE) </w:t>
+      <w:proofErr w:type="spellStart"/>
+      <w:r>
+        <w:rPr>
+          <w:rFonts w:ascii="TH Sarabun New" w:hAnsi="TH Sarabun New" w:cs="TH Sarabun New"/>
+          <w:sz w:val="32"/>
+          <w:szCs w:val="32"/>
+        </w:rPr>
+        <w:t>CoE</w:t>
+      </w:r>
+      <w:proofErr w:type="spellEnd"/>
+      <w:r>
+        <w:rPr>
+          <w:rFonts w:ascii="TH Sarabun New" w:hAnsi="TH Sarabun New" w:cs="TH Sarabun New"/>
+          <w:sz w:val="32"/>
+          <w:szCs w:val="32"/>
+        </w:rPr>
+        <w:t xml:space="preserve">) </w:t>
       </w:r>
       <w:r>
         <w:rPr>
@@ -195,7 +227,27 @@
           <w:szCs w:val="32"/>
           <w:cs/>
         </w:rPr>
-        <w:t xml:space="preserve">ทำหน้าที่เป็นโหนดสำหรับวัดค่าสภาพแวดล้อมต่างๆ และส่งข้อมูลไปยัง </w:t>
+        <w:t>ทำหน้าที่เป็น</w:t>
+      </w:r>
+      <w:proofErr w:type="spellStart"/>
+      <w:r>
+        <w:rPr>
+          <w:rFonts w:ascii="TH Sarabun New" w:hAnsi="TH Sarabun New" w:cs="TH Sarabun New"/>
+          <w:sz w:val="32"/>
+          <w:szCs w:val="32"/>
+          <w:cs/>
+        </w:rPr>
+        <w:t>โหนด</w:t>
+      </w:r>
+      <w:proofErr w:type="spellEnd"/>
+      <w:r>
+        <w:rPr>
+          <w:rFonts w:ascii="TH Sarabun New" w:hAnsi="TH Sarabun New" w:cs="TH Sarabun New"/>
+          <w:sz w:val="32"/>
+          <w:szCs w:val="32"/>
+          <w:cs/>
+        </w:rPr>
+        <w:t xml:space="preserve">สำหรับวัดค่าสภาพแวดล้อมต่างๆ และส่งข้อมูลไปยัง </w:t>
       </w:r>
       <w:r>
         <w:rPr>
@@ -689,8 +741,18 @@
           <w:sz w:val="32"/>
           <w:szCs w:val="32"/>
         </w:rPr>
-        <w:t>Co-CoE</w:t>
-      </w:r>
+        <w:t>Co-</w:t>
+      </w:r>
+      <w:proofErr w:type="spellStart"/>
+      <w:r>
+        <w:rPr>
+          <w:rFonts w:ascii="TH Sarabun New" w:hAnsi="TH Sarabun New" w:cs="TH Sarabun New"/>
+          <w:sz w:val="32"/>
+          <w:szCs w:val="32"/>
+        </w:rPr>
+        <w:t>CoE</w:t>
+      </w:r>
+      <w:proofErr w:type="spellEnd"/>
     </w:p>
     <w:p>
       <w:pPr>
@@ -790,7 +852,25 @@
           <w:sz w:val="32"/>
           <w:szCs w:val="32"/>
         </w:rPr>
-        <w:t xml:space="preserve">Co-CoE) </w:t>
+        <w:t>Co-</w:t>
+      </w:r>
+      <w:proofErr w:type="spellStart"/>
+      <w:r>
+        <w:rPr>
+          <w:rFonts w:ascii="TH Sarabun New" w:hAnsi="TH Sarabun New" w:cs="TH Sarabun New"/>
+          <w:sz w:val="32"/>
+          <w:szCs w:val="32"/>
+        </w:rPr>
+        <w:t>CoE</w:t>
+      </w:r>
+      <w:proofErr w:type="spellEnd"/>
+      <w:r>
+        <w:rPr>
+          <w:rFonts w:ascii="TH Sarabun New" w:hAnsi="TH Sarabun New" w:cs="TH Sarabun New"/>
+          <w:sz w:val="32"/>
+          <w:szCs w:val="32"/>
+        </w:rPr>
+        <w:t xml:space="preserve">) </w:t>
       </w:r>
       <w:r>
         <w:rPr>
@@ -1417,7 +1497,31 @@
           <w:szCs w:val="32"/>
           <w:cs/>
         </w:rPr>
-        <w:t>สถาปัตยกรรมระบบคลาวด์ (</w:t>
+        <w:t>สถาปัตยกรรมระบบคลาว</w:t>
+      </w:r>
+      <w:proofErr w:type="spellStart"/>
+      <w:r>
+        <w:rPr>
+          <w:rFonts w:ascii="TH Sarabun New" w:hAnsi="TH Sarabun New" w:cs="TH Sarabun New"/>
+          <w:b/>
+          <w:bCs/>
+          <w:sz w:val="32"/>
+          <w:szCs w:val="32"/>
+          <w:cs/>
+        </w:rPr>
+        <w:t>ด์</w:t>
+      </w:r>
+      <w:proofErr w:type="spellEnd"/>
+      <w:r>
+        <w:rPr>
+          <w:rFonts w:ascii="TH Sarabun New" w:hAnsi="TH Sarabun New" w:cs="TH Sarabun New"/>
+          <w:b/>
+          <w:bCs/>
+          <w:sz w:val="32"/>
+          <w:szCs w:val="32"/>
+          <w:cs/>
+        </w:rPr>
+        <w:t xml:space="preserve"> (</w:t>
       </w:r>
       <w:r>
         <w:rPr>
@@ -2743,7 +2847,25 @@
                 <w:sz w:val="32"/>
                 <w:szCs w:val="32"/>
               </w:rPr>
-              <w:t xml:space="preserve">    DeviceId </w:t>
+              <w:t xml:space="preserve">    </w:t>
+            </w:r>
+            <w:proofErr w:type="spellStart"/>
+            <w:r>
+              <w:rPr>
+                <w:rFonts w:ascii="TH Sarabun New" w:hAnsi="TH Sarabun New" w:cs="TH Sarabun New"/>
+                <w:sz w:val="32"/>
+                <w:szCs w:val="32"/>
+              </w:rPr>
+              <w:t>DeviceId</w:t>
+            </w:r>
+            <w:proofErr w:type="spellEnd"/>
+            <w:r>
+              <w:rPr>
+                <w:rFonts w:ascii="TH Sarabun New" w:hAnsi="TH Sarabun New" w:cs="TH Sarabun New"/>
+                <w:sz w:val="32"/>
+                <w:szCs w:val="32"/>
+              </w:rPr>
+              <w:t xml:space="preserve"> </w:t>
             </w:r>
             <w:proofErr w:type="gramStart"/>
             <w:r>
@@ -2806,7 +2928,25 @@
                 <w:sz w:val="32"/>
                 <w:szCs w:val="32"/>
               </w:rPr>
-              <w:t xml:space="preserve">    SensorType </w:t>
+              <w:t xml:space="preserve">    </w:t>
+            </w:r>
+            <w:proofErr w:type="spellStart"/>
+            <w:r>
+              <w:rPr>
+                <w:rFonts w:ascii="TH Sarabun New" w:hAnsi="TH Sarabun New" w:cs="TH Sarabun New"/>
+                <w:sz w:val="32"/>
+                <w:szCs w:val="32"/>
+              </w:rPr>
+              <w:t>SensorType</w:t>
+            </w:r>
+            <w:proofErr w:type="spellEnd"/>
+            <w:r>
+              <w:rPr>
+                <w:rFonts w:ascii="TH Sarabun New" w:hAnsi="TH Sarabun New" w:cs="TH Sarabun New"/>
+                <w:sz w:val="32"/>
+                <w:szCs w:val="32"/>
+              </w:rPr>
+              <w:t xml:space="preserve"> </w:t>
             </w:r>
             <w:proofErr w:type="gramStart"/>
             <w:r>
@@ -2842,7 +2982,25 @@
                 <w:sz w:val="32"/>
                 <w:szCs w:val="32"/>
               </w:rPr>
-              <w:t xml:space="preserve">    SensorValue FLOAT NOT NULL,</w:t>
+              <w:t xml:space="preserve">    </w:t>
+            </w:r>
+            <w:proofErr w:type="spellStart"/>
+            <w:r>
+              <w:rPr>
+                <w:rFonts w:ascii="TH Sarabun New" w:hAnsi="TH Sarabun New" w:cs="TH Sarabun New"/>
+                <w:sz w:val="32"/>
+                <w:szCs w:val="32"/>
+              </w:rPr>
+              <w:t>SensorValue</w:t>
+            </w:r>
+            <w:proofErr w:type="spellEnd"/>
+            <w:r>
+              <w:rPr>
+                <w:rFonts w:ascii="TH Sarabun New" w:hAnsi="TH Sarabun New" w:cs="TH Sarabun New"/>
+                <w:sz w:val="32"/>
+                <w:szCs w:val="32"/>
+              </w:rPr>
+              <w:t xml:space="preserve"> FLOAT NOT NULL,</w:t>
             </w:r>
           </w:p>
           <w:p>
@@ -2860,7 +3018,25 @@
                 <w:sz w:val="32"/>
                 <w:szCs w:val="32"/>
               </w:rPr>
-              <w:t xml:space="preserve">    QualityStatus TINYINT DEFAULT </w:t>
+              <w:t xml:space="preserve">    </w:t>
+            </w:r>
+            <w:proofErr w:type="spellStart"/>
+            <w:r>
+              <w:rPr>
+                <w:rFonts w:ascii="TH Sarabun New" w:hAnsi="TH Sarabun New" w:cs="TH Sarabun New"/>
+                <w:sz w:val="32"/>
+                <w:szCs w:val="32"/>
+              </w:rPr>
+              <w:t>QualityStatus</w:t>
+            </w:r>
+            <w:proofErr w:type="spellEnd"/>
+            <w:r>
+              <w:rPr>
+                <w:rFonts w:ascii="TH Sarabun New" w:hAnsi="TH Sarabun New" w:cs="TH Sarabun New"/>
+                <w:sz w:val="32"/>
+                <w:szCs w:val="32"/>
+              </w:rPr>
+              <w:t xml:space="preserve"> TINYINT DEFAULT </w:t>
             </w:r>
             <w:proofErr w:type="gramStart"/>
             <w:r>
@@ -2896,7 +3072,25 @@
                 <w:sz w:val="32"/>
                 <w:szCs w:val="32"/>
               </w:rPr>
-              <w:t xml:space="preserve">    CreatedAt DATETIME2 DEFAULT </w:t>
+              <w:t xml:space="preserve">    </w:t>
+            </w:r>
+            <w:proofErr w:type="spellStart"/>
+            <w:r>
+              <w:rPr>
+                <w:rFonts w:ascii="TH Sarabun New" w:hAnsi="TH Sarabun New" w:cs="TH Sarabun New"/>
+                <w:sz w:val="32"/>
+                <w:szCs w:val="32"/>
+              </w:rPr>
+              <w:t>CreatedAt</w:t>
+            </w:r>
+            <w:proofErr w:type="spellEnd"/>
+            <w:r>
+              <w:rPr>
+                <w:rFonts w:ascii="TH Sarabun New" w:hAnsi="TH Sarabun New" w:cs="TH Sarabun New"/>
+                <w:sz w:val="32"/>
+                <w:szCs w:val="32"/>
+              </w:rPr>
+              <w:t xml:space="preserve"> DATETIME2 DEFAULT </w:t>
             </w:r>
             <w:proofErr w:type="gramStart"/>
             <w:r>
@@ -3098,15 +3292,27 @@
           <w:szCs w:val="32"/>
         </w:rPr>
       </w:pPr>
-      <w:r>
-        <w:rPr>
-          <w:rFonts w:ascii="TH Sarabun New" w:hAnsi="TH Sarabun New" w:cs="TH Sarabun New"/>
-          <w:b/>
-          <w:bCs/>
-          <w:sz w:val="32"/>
-          <w:szCs w:val="32"/>
-        </w:rPr>
-        <w:t>DeviceId (</w:t>
+      <w:proofErr w:type="spellStart"/>
+      <w:r>
+        <w:rPr>
+          <w:rFonts w:ascii="TH Sarabun New" w:hAnsi="TH Sarabun New" w:cs="TH Sarabun New"/>
+          <w:b/>
+          <w:bCs/>
+          <w:sz w:val="32"/>
+          <w:szCs w:val="32"/>
+        </w:rPr>
+        <w:t>DeviceId</w:t>
+      </w:r>
+      <w:proofErr w:type="spellEnd"/>
+      <w:r>
+        <w:rPr>
+          <w:rFonts w:ascii="TH Sarabun New" w:hAnsi="TH Sarabun New" w:cs="TH Sarabun New"/>
+          <w:b/>
+          <w:bCs/>
+          <w:sz w:val="32"/>
+          <w:szCs w:val="32"/>
+        </w:rPr>
+        <w:t xml:space="preserve"> (</w:t>
       </w:r>
       <w:proofErr w:type="gramStart"/>
       <w:r>
@@ -3145,7 +3351,27 @@
           <w:szCs w:val="32"/>
           <w:cs/>
         </w:rPr>
-        <w:t>รหัสประจำตัวของอุปกรณ์หรือโหนดที่ส่งข้อมูล การใช้</w:t>
+        <w:t>รหัสประจำตัวของอุปกรณ์หรือ</w:t>
+      </w:r>
+      <w:proofErr w:type="spellStart"/>
+      <w:r>
+        <w:rPr>
+          <w:rFonts w:ascii="TH Sarabun New" w:hAnsi="TH Sarabun New" w:cs="TH Sarabun New"/>
+          <w:sz w:val="32"/>
+          <w:szCs w:val="32"/>
+          <w:cs/>
+        </w:rPr>
+        <w:t>โหนด</w:t>
+      </w:r>
+      <w:proofErr w:type="spellEnd"/>
+      <w:r>
+        <w:rPr>
+          <w:rFonts w:ascii="TH Sarabun New" w:hAnsi="TH Sarabun New" w:cs="TH Sarabun New"/>
+          <w:sz w:val="32"/>
+          <w:szCs w:val="32"/>
+          <w:cs/>
+        </w:rPr>
+        <w:t>ที่ส่งข้อมูล การใช้</w:t>
       </w:r>
       <w:r>
         <w:rPr>
@@ -3177,15 +3403,27 @@
           <w:szCs w:val="32"/>
         </w:rPr>
       </w:pPr>
-      <w:r>
-        <w:rPr>
-          <w:rFonts w:ascii="TH Sarabun New" w:hAnsi="TH Sarabun New" w:cs="TH Sarabun New"/>
-          <w:b/>
-          <w:bCs/>
-          <w:sz w:val="32"/>
-          <w:szCs w:val="32"/>
-        </w:rPr>
-        <w:t>SensorType (</w:t>
+      <w:proofErr w:type="spellStart"/>
+      <w:r>
+        <w:rPr>
+          <w:rFonts w:ascii="TH Sarabun New" w:hAnsi="TH Sarabun New" w:cs="TH Sarabun New"/>
+          <w:b/>
+          <w:bCs/>
+          <w:sz w:val="32"/>
+          <w:szCs w:val="32"/>
+        </w:rPr>
+        <w:t>SensorType</w:t>
+      </w:r>
+      <w:proofErr w:type="spellEnd"/>
+      <w:r>
+        <w:rPr>
+          <w:rFonts w:ascii="TH Sarabun New" w:hAnsi="TH Sarabun New" w:cs="TH Sarabun New"/>
+          <w:b/>
+          <w:bCs/>
+          <w:sz w:val="32"/>
+          <w:szCs w:val="32"/>
+        </w:rPr>
+        <w:t xml:space="preserve"> (</w:t>
       </w:r>
       <w:proofErr w:type="gramStart"/>
       <w:r>
@@ -3281,15 +3519,27 @@
           <w:szCs w:val="32"/>
         </w:rPr>
       </w:pPr>
-      <w:r>
-        <w:rPr>
-          <w:rFonts w:ascii="TH Sarabun New" w:hAnsi="TH Sarabun New" w:cs="TH Sarabun New"/>
-          <w:b/>
-          <w:bCs/>
-          <w:sz w:val="32"/>
-          <w:szCs w:val="32"/>
-        </w:rPr>
-        <w:t>SensorValue (FLOAT):</w:t>
+      <w:proofErr w:type="spellStart"/>
+      <w:r>
+        <w:rPr>
+          <w:rFonts w:ascii="TH Sarabun New" w:hAnsi="TH Sarabun New" w:cs="TH Sarabun New"/>
+          <w:b/>
+          <w:bCs/>
+          <w:sz w:val="32"/>
+          <w:szCs w:val="32"/>
+        </w:rPr>
+        <w:t>SensorValue</w:t>
+      </w:r>
+      <w:proofErr w:type="spellEnd"/>
+      <w:r>
+        <w:rPr>
+          <w:rFonts w:ascii="TH Sarabun New" w:hAnsi="TH Sarabun New" w:cs="TH Sarabun New"/>
+          <w:b/>
+          <w:bCs/>
+          <w:sz w:val="32"/>
+          <w:szCs w:val="32"/>
+        </w:rPr>
+        <w:t xml:space="preserve"> (FLOAT):</w:t>
       </w:r>
       <w:r>
         <w:rPr>
@@ -3321,6 +3571,7 @@
           <w:szCs w:val="32"/>
         </w:rPr>
       </w:pPr>
+      <w:proofErr w:type="spellStart"/>
       <w:proofErr w:type="gramStart"/>
       <w:r>
         <w:rPr>
@@ -3332,6 +3583,7 @@
         </w:rPr>
         <w:t>QualityStatus</w:t>
       </w:r>
+      <w:proofErr w:type="spellEnd"/>
       <w:proofErr w:type="gramEnd"/>
       <w:r>
         <w:rPr>
@@ -3424,15 +3676,27 @@
           <w:szCs w:val="32"/>
         </w:rPr>
       </w:pPr>
-      <w:r>
-        <w:rPr>
-          <w:rFonts w:ascii="TH Sarabun New" w:hAnsi="TH Sarabun New" w:cs="TH Sarabun New"/>
-          <w:b/>
-          <w:bCs/>
-          <w:sz w:val="32"/>
-          <w:szCs w:val="32"/>
-        </w:rPr>
-        <w:t>CreatedAt (DATETIME2):</w:t>
+      <w:proofErr w:type="spellStart"/>
+      <w:r>
+        <w:rPr>
+          <w:rFonts w:ascii="TH Sarabun New" w:hAnsi="TH Sarabun New" w:cs="TH Sarabun New"/>
+          <w:b/>
+          <w:bCs/>
+          <w:sz w:val="32"/>
+          <w:szCs w:val="32"/>
+        </w:rPr>
+        <w:t>CreatedAt</w:t>
+      </w:r>
+      <w:proofErr w:type="spellEnd"/>
+      <w:r>
+        <w:rPr>
+          <w:rFonts w:ascii="TH Sarabun New" w:hAnsi="TH Sarabun New" w:cs="TH Sarabun New"/>
+          <w:b/>
+          <w:bCs/>
+          <w:sz w:val="32"/>
+          <w:szCs w:val="32"/>
+        </w:rPr>
+        <w:t xml:space="preserve"> (DATETIME2):</w:t>
       </w:r>
       <w:r>
         <w:rPr>
@@ -3550,7 +3814,7 @@
     <w:p>
       <w:pPr>
         <w:rPr>
-          <w:rFonts w:ascii="TH Sarabun New" w:hAnsi="TH Sarabun New" w:cs="TH Sarabun New" w:hint="cs"/>
+          <w:rFonts w:ascii="TH Sarabun New" w:hAnsi="TH Sarabun New" w:cs="TH Sarabun New"/>
           <w:sz w:val="32"/>
           <w:szCs w:val="32"/>
           <w:cs/>
@@ -5383,6 +5647,7 @@
   <w:style w:type="character" w:default="1" w:styleId="a0">
     <w:name w:val="Default Paragraph Font"/>
     <w:uiPriority w:val="1"/>
+    <w:semiHidden/>
     <w:unhideWhenUsed/>
   </w:style>
   <w:style w:type="table" w:default="1" w:styleId="a1">

</xml_diff>